<commit_message>
updated html files all CV doc files
</commit_message>
<xml_diff>
--- a/CV_DataEngineer_Promise_Ekwurumadu.docx
+++ b/CV_DataEngineer_Promise_Ekwurumadu.docx
@@ -31,140 +31,7 @@
           <w:sz w:val="24"/>
           <w:szCs w:val="24"/>
         </w:rPr>
-        <w:t xml:space="preserve">Data </w:t>
-      </w:r>
-      <w:proofErr w:type="gramStart"/>
-      <w:r>
-        <w:rPr>
-          <w:rFonts w:ascii="Calibri" w:eastAsia="Calibri" w:hAnsi="Calibri" w:cs="Calibri"/>
-          <w:i/>
-          <w:iCs/>
-          <w:color w:val="555555"/>
-          <w:sz w:val="24"/>
-          <w:szCs w:val="24"/>
-        </w:rPr>
-        <w:t>Engineer  |</w:t>
-      </w:r>
-      <w:proofErr w:type="gramEnd"/>
-      <w:r>
-        <w:rPr>
-          <w:rFonts w:ascii="Calibri" w:eastAsia="Calibri" w:hAnsi="Calibri" w:cs="Calibri"/>
-          <w:i/>
-          <w:iCs/>
-          <w:color w:val="555555"/>
-          <w:sz w:val="24"/>
-          <w:szCs w:val="24"/>
-        </w:rPr>
-        <w:t xml:space="preserve">  ETL </w:t>
-      </w:r>
-      <w:proofErr w:type="gramStart"/>
-      <w:r>
-        <w:rPr>
-          <w:rFonts w:ascii="Calibri" w:eastAsia="Calibri" w:hAnsi="Calibri" w:cs="Calibri"/>
-          <w:i/>
-          <w:iCs/>
-          <w:color w:val="555555"/>
-          <w:sz w:val="24"/>
-          <w:szCs w:val="24"/>
-        </w:rPr>
-        <w:t>Pipelines  |</w:t>
-      </w:r>
-      <w:proofErr w:type="gramEnd"/>
-      <w:r>
-        <w:rPr>
-          <w:rFonts w:ascii="Calibri" w:eastAsia="Calibri" w:hAnsi="Calibri" w:cs="Calibri"/>
-          <w:i/>
-          <w:iCs/>
-          <w:color w:val="555555"/>
-          <w:sz w:val="24"/>
-          <w:szCs w:val="24"/>
-        </w:rPr>
-        <w:t xml:space="preserve">  </w:t>
-      </w:r>
-      <w:proofErr w:type="spellStart"/>
-      <w:proofErr w:type="gramStart"/>
-      <w:r>
-        <w:rPr>
-          <w:rFonts w:ascii="Calibri" w:eastAsia="Calibri" w:hAnsi="Calibri" w:cs="Calibri"/>
-          <w:i/>
-          <w:iCs/>
-          <w:color w:val="555555"/>
-          <w:sz w:val="24"/>
-          <w:szCs w:val="24"/>
-        </w:rPr>
-        <w:t>PySpark</w:t>
-      </w:r>
-      <w:proofErr w:type="spellEnd"/>
-      <w:r>
-        <w:rPr>
-          <w:rFonts w:ascii="Calibri" w:eastAsia="Calibri" w:hAnsi="Calibri" w:cs="Calibri"/>
-          <w:i/>
-          <w:iCs/>
-          <w:color w:val="555555"/>
-          <w:sz w:val="24"/>
-          <w:szCs w:val="24"/>
-        </w:rPr>
-        <w:t xml:space="preserve">  |</w:t>
-      </w:r>
-      <w:proofErr w:type="gramEnd"/>
-      <w:r>
-        <w:rPr>
-          <w:rFonts w:ascii="Calibri" w:eastAsia="Calibri" w:hAnsi="Calibri" w:cs="Calibri"/>
-          <w:i/>
-          <w:iCs/>
-          <w:color w:val="555555"/>
-          <w:sz w:val="24"/>
-          <w:szCs w:val="24"/>
-        </w:rPr>
-        <w:t xml:space="preserve">  </w:t>
-      </w:r>
-      <w:proofErr w:type="gramStart"/>
-      <w:r>
-        <w:rPr>
-          <w:rFonts w:ascii="Calibri" w:eastAsia="Calibri" w:hAnsi="Calibri" w:cs="Calibri"/>
-          <w:i/>
-          <w:iCs/>
-          <w:color w:val="555555"/>
-          <w:sz w:val="24"/>
-          <w:szCs w:val="24"/>
-        </w:rPr>
-        <w:t>Hadoop  |</w:t>
-      </w:r>
-      <w:proofErr w:type="gramEnd"/>
-      <w:r>
-        <w:rPr>
-          <w:rFonts w:ascii="Calibri" w:eastAsia="Calibri" w:hAnsi="Calibri" w:cs="Calibri"/>
-          <w:i/>
-          <w:iCs/>
-          <w:color w:val="555555"/>
-          <w:sz w:val="24"/>
-          <w:szCs w:val="24"/>
-        </w:rPr>
-        <w:t xml:space="preserve">  </w:t>
-      </w:r>
-      <w:proofErr w:type="gramStart"/>
-      <w:r>
-        <w:rPr>
-          <w:rFonts w:ascii="Calibri" w:eastAsia="Calibri" w:hAnsi="Calibri" w:cs="Calibri"/>
-          <w:i/>
-          <w:iCs/>
-          <w:color w:val="555555"/>
-          <w:sz w:val="24"/>
-          <w:szCs w:val="24"/>
-        </w:rPr>
-        <w:t>PostgreSQL  |</w:t>
-      </w:r>
-      <w:proofErr w:type="gramEnd"/>
-      <w:r>
-        <w:rPr>
-          <w:rFonts w:ascii="Calibri" w:eastAsia="Calibri" w:hAnsi="Calibri" w:cs="Calibri"/>
-          <w:i/>
-          <w:iCs/>
-          <w:color w:val="555555"/>
-          <w:sz w:val="24"/>
-          <w:szCs w:val="24"/>
-        </w:rPr>
-        <w:t xml:space="preserve">  Docker</w:t>
+        <w:t>Data Engineer  |  ETL Pipelines  |  PySpark  |  Hadoop  |  PostgreSQL  |  Docker</w:t>
       </w:r>
     </w:p>
     <w:p>
@@ -212,32 +79,7 @@
           <w:rFonts w:ascii="Calibri" w:eastAsia="Calibri" w:hAnsi="Calibri" w:cs="Calibri"/>
           <w:color w:val="555555"/>
         </w:rPr>
-        <w:t>github.com/</w:t>
-      </w:r>
-      <w:proofErr w:type="spellStart"/>
-      <w:proofErr w:type="gramStart"/>
-      <w:r>
-        <w:rPr>
-          <w:rFonts w:ascii="Calibri" w:eastAsia="Calibri" w:hAnsi="Calibri" w:cs="Calibri"/>
-          <w:color w:val="555555"/>
-        </w:rPr>
-        <w:t>promiseekwurumadu</w:t>
-      </w:r>
-      <w:proofErr w:type="spellEnd"/>
-      <w:r>
-        <w:rPr>
-          <w:rFonts w:ascii="Calibri" w:eastAsia="Calibri" w:hAnsi="Calibri" w:cs="Calibri"/>
-          <w:color w:val="555555"/>
-        </w:rPr>
-        <w:t xml:space="preserve">  |</w:t>
-      </w:r>
-      <w:proofErr w:type="gramEnd"/>
-      <w:r>
-        <w:rPr>
-          <w:rFonts w:ascii="Calibri" w:eastAsia="Calibri" w:hAnsi="Calibri" w:cs="Calibri"/>
-          <w:color w:val="555555"/>
-        </w:rPr>
-        <w:t xml:space="preserve">  07444082072</w:t>
+        <w:t>github.com/promiseekwurumadu  |  07444082072</w:t>
       </w:r>
     </w:p>
     <w:p>
@@ -271,27 +113,7 @@
           <w:sz w:val="21"/>
           <w:szCs w:val="21"/>
         </w:rPr>
-        <w:t xml:space="preserve">Data Engineer with MSc Applied Data Science and demonstrated experience designing and building automated ETL pipelines, relational database systems and distributed computing solutions using </w:t>
-      </w:r>
-      <w:proofErr w:type="spellStart"/>
-      <w:r>
-        <w:rPr>
-          <w:rFonts w:ascii="Calibri" w:eastAsia="Calibri" w:hAnsi="Calibri" w:cs="Calibri"/>
-          <w:color w:val="555555"/>
-          <w:sz w:val="21"/>
-          <w:szCs w:val="21"/>
-        </w:rPr>
-        <w:t>PySpark</w:t>
-      </w:r>
-      <w:proofErr w:type="spellEnd"/>
-      <w:r>
-        <w:rPr>
-          <w:rFonts w:ascii="Calibri" w:eastAsia="Calibri" w:hAnsi="Calibri" w:cs="Calibri"/>
-          <w:color w:val="555555"/>
-          <w:sz w:val="21"/>
-          <w:szCs w:val="21"/>
-        </w:rPr>
-        <w:t xml:space="preserve"> and Hadoop. Currently working in the UK at Komatsu, a global technology manufacturer, while building a substantial data engineering portfolio using real government datasets.</w:t>
+        <w:t>Data Engineer with MSc Applied Data Science and demonstrated experience designing and building automated ETL pipelines, relational database systems and distributed computing solutions using PySpark and Hadoop. Currently working in the UK at Komatsu, a global technology manufacturer, while building a substantial data engineering portfolio using real government datasets.</w:t>
       </w:r>
     </w:p>
     <w:p>
@@ -352,12 +174,6 @@
         <w:gridCol w:w="6626"/>
       </w:tblGrid>
       <w:tr>
-        <w:tblPrEx>
-          <w:tblCellMar>
-            <w:top w:w="0" w:type="dxa"/>
-            <w:bottom w:w="0" w:type="dxa"/>
-          </w:tblCellMar>
-        </w:tblPrEx>
         <w:tc>
           <w:tcPr>
             <w:tcW w:w="2400" w:type="dxa"/>
@@ -413,38 +229,12 @@
                 <w:sz w:val="19"/>
                 <w:szCs w:val="19"/>
               </w:rPr>
-              <w:t>Apache Spark (</w:t>
-            </w:r>
-            <w:proofErr w:type="spellStart"/>
-            <w:r>
-              <w:rPr>
-                <w:rFonts w:ascii="Calibri" w:eastAsia="Calibri" w:hAnsi="Calibri" w:cs="Calibri"/>
-                <w:color w:val="555555"/>
-                <w:sz w:val="19"/>
-                <w:szCs w:val="19"/>
-              </w:rPr>
-              <w:t>PySpark</w:t>
-            </w:r>
-            <w:proofErr w:type="spellEnd"/>
-            <w:r>
-              <w:rPr>
-                <w:rFonts w:ascii="Calibri" w:eastAsia="Calibri" w:hAnsi="Calibri" w:cs="Calibri"/>
-                <w:color w:val="555555"/>
-                <w:sz w:val="19"/>
-                <w:szCs w:val="19"/>
-              </w:rPr>
-              <w:t xml:space="preserve"> 4.x) · Hadoop HDFS · Distributed computing · Docker</w:t>
+              <w:t>Apache Spark (PySpark 4.x) · Hadoop HDFS · Distributed computing · Docker</w:t>
             </w:r>
           </w:p>
         </w:tc>
       </w:tr>
       <w:tr>
-        <w:tblPrEx>
-          <w:tblCellMar>
-            <w:top w:w="0" w:type="dxa"/>
-            <w:bottom w:w="0" w:type="dxa"/>
-          </w:tblCellMar>
-        </w:tblPrEx>
         <w:tc>
           <w:tcPr>
             <w:tcW w:w="2400" w:type="dxa"/>
@@ -506,12 +296,6 @@
         </w:tc>
       </w:tr>
       <w:tr>
-        <w:tblPrEx>
-          <w:tblCellMar>
-            <w:top w:w="0" w:type="dxa"/>
-            <w:bottom w:w="0" w:type="dxa"/>
-          </w:tblCellMar>
-        </w:tblPrEx>
         <w:tc>
           <w:tcPr>
             <w:tcW w:w="2400" w:type="dxa"/>
@@ -567,58 +351,12 @@
                 <w:sz w:val="19"/>
                 <w:szCs w:val="19"/>
               </w:rPr>
-              <w:t xml:space="preserve">PostgreSQL · MySQL · SQLite · </w:t>
-            </w:r>
-            <w:proofErr w:type="spellStart"/>
-            <w:r>
-              <w:rPr>
-                <w:rFonts w:ascii="Calibri" w:eastAsia="Calibri" w:hAnsi="Calibri" w:cs="Calibri"/>
-                <w:color w:val="555555"/>
-                <w:sz w:val="19"/>
-                <w:szCs w:val="19"/>
-              </w:rPr>
-              <w:t>pgAdmin</w:t>
-            </w:r>
-            <w:proofErr w:type="spellEnd"/>
-            <w:r>
-              <w:rPr>
-                <w:rFonts w:ascii="Calibri" w:eastAsia="Calibri" w:hAnsi="Calibri" w:cs="Calibri"/>
-                <w:color w:val="555555"/>
-                <w:sz w:val="19"/>
-                <w:szCs w:val="19"/>
-              </w:rPr>
-              <w:t xml:space="preserve"> · </w:t>
-            </w:r>
-            <w:proofErr w:type="spellStart"/>
-            <w:r>
-              <w:rPr>
-                <w:rFonts w:ascii="Calibri" w:eastAsia="Calibri" w:hAnsi="Calibri" w:cs="Calibri"/>
-                <w:color w:val="555555"/>
-                <w:sz w:val="19"/>
-                <w:szCs w:val="19"/>
-              </w:rPr>
-              <w:t>SQLAlchemy</w:t>
-            </w:r>
-            <w:proofErr w:type="spellEnd"/>
-            <w:r>
-              <w:rPr>
-                <w:rFonts w:ascii="Calibri" w:eastAsia="Calibri" w:hAnsi="Calibri" w:cs="Calibri"/>
-                <w:color w:val="555555"/>
-                <w:sz w:val="19"/>
-                <w:szCs w:val="19"/>
-              </w:rPr>
-              <w:t xml:space="preserve"> · Database normalisation</w:t>
+              <w:t>PostgreSQL · MySQL · SQLite · pgAdmin · SQLAlchemy · Database normalisation</w:t>
             </w:r>
           </w:p>
         </w:tc>
       </w:tr>
       <w:tr>
-        <w:tblPrEx>
-          <w:tblCellMar>
-            <w:top w:w="0" w:type="dxa"/>
-            <w:bottom w:w="0" w:type="dxa"/>
-          </w:tblCellMar>
-        </w:tblPrEx>
         <w:tc>
           <w:tcPr>
             <w:tcW w:w="2400" w:type="dxa"/>
@@ -674,58 +412,12 @@
                 <w:sz w:val="19"/>
                 <w:szCs w:val="19"/>
               </w:rPr>
-              <w:t xml:space="preserve">Python (Pandas, </w:t>
-            </w:r>
-            <w:proofErr w:type="spellStart"/>
-            <w:r>
-              <w:rPr>
-                <w:rFonts w:ascii="Calibri" w:eastAsia="Calibri" w:hAnsi="Calibri" w:cs="Calibri"/>
-                <w:color w:val="555555"/>
-                <w:sz w:val="19"/>
-                <w:szCs w:val="19"/>
-              </w:rPr>
-              <w:t>PySpark</w:t>
-            </w:r>
-            <w:proofErr w:type="spellEnd"/>
-            <w:r>
-              <w:rPr>
-                <w:rFonts w:ascii="Calibri" w:eastAsia="Calibri" w:hAnsi="Calibri" w:cs="Calibri"/>
-                <w:color w:val="555555"/>
-                <w:sz w:val="19"/>
-                <w:szCs w:val="19"/>
-              </w:rPr>
-              <w:t xml:space="preserve">, </w:t>
-            </w:r>
-            <w:proofErr w:type="spellStart"/>
-            <w:r>
-              <w:rPr>
-                <w:rFonts w:ascii="Calibri" w:eastAsia="Calibri" w:hAnsi="Calibri" w:cs="Calibri"/>
-                <w:color w:val="555555"/>
-                <w:sz w:val="19"/>
-                <w:szCs w:val="19"/>
-              </w:rPr>
-              <w:t>SQLAlchemy</w:t>
-            </w:r>
-            <w:proofErr w:type="spellEnd"/>
-            <w:r>
-              <w:rPr>
-                <w:rFonts w:ascii="Calibri" w:eastAsia="Calibri" w:hAnsi="Calibri" w:cs="Calibri"/>
-                <w:color w:val="555555"/>
-                <w:sz w:val="19"/>
-                <w:szCs w:val="19"/>
-              </w:rPr>
-              <w:t>) · SQL (advanced) · Bash scripting</w:t>
+              <w:t>Python (Pandas, PySpark, SQLAlchemy) · SQL (advanced) · Bash scripting</w:t>
             </w:r>
           </w:p>
         </w:tc>
       </w:tr>
       <w:tr>
-        <w:tblPrEx>
-          <w:tblCellMar>
-            <w:top w:w="0" w:type="dxa"/>
-            <w:bottom w:w="0" w:type="dxa"/>
-          </w:tblCellMar>
-        </w:tblPrEx>
         <w:tc>
           <w:tcPr>
             <w:tcW w:w="2400" w:type="dxa"/>
@@ -787,12 +479,6 @@
         </w:tc>
       </w:tr>
       <w:tr>
-        <w:tblPrEx>
-          <w:tblCellMar>
-            <w:top w:w="0" w:type="dxa"/>
-            <w:bottom w:w="0" w:type="dxa"/>
-          </w:tblCellMar>
-        </w:tblPrEx>
         <w:tc>
           <w:tcPr>
             <w:tcW w:w="2400" w:type="dxa"/>
@@ -841,7 +527,6 @@
             </w:tcMar>
           </w:tcPr>
           <w:p>
-            <w:proofErr w:type="spellStart"/>
             <w:r>
               <w:rPr>
                 <w:rFonts w:ascii="Calibri" w:eastAsia="Calibri" w:hAnsi="Calibri" w:cs="Calibri"/>
@@ -849,17 +534,7 @@
                 <w:sz w:val="19"/>
                 <w:szCs w:val="19"/>
               </w:rPr>
-              <w:t>Streamlit</w:t>
-            </w:r>
-            <w:proofErr w:type="spellEnd"/>
-            <w:r>
-              <w:rPr>
-                <w:rFonts w:ascii="Calibri" w:eastAsia="Calibri" w:hAnsi="Calibri" w:cs="Calibri"/>
-                <w:color w:val="555555"/>
-                <w:sz w:val="19"/>
-                <w:szCs w:val="19"/>
-              </w:rPr>
-              <w:t xml:space="preserve"> (deployed live) · Power BI (live PostgreSQL connection) · Plotly</w:t>
+              <w:t>Streamlit (deployed live) · Power BI (live PostgreSQL connection) · Plotly</w:t>
             </w:r>
           </w:p>
         </w:tc>
@@ -906,12 +581,6 @@
         <w:gridCol w:w="9026"/>
       </w:tblGrid>
       <w:tr>
-        <w:tblPrEx>
-          <w:tblCellMar>
-            <w:top w:w="0" w:type="dxa"/>
-            <w:bottom w:w="0" w:type="dxa"/>
-          </w:tblCellMar>
-        </w:tblPrEx>
         <w:tc>
           <w:tcPr>
             <w:tcW w:w="0" w:type="auto"/>
@@ -933,7 +602,6 @@
             <w:pPr>
               <w:spacing w:after="40"/>
             </w:pPr>
-            <w:proofErr w:type="gramStart"/>
             <w:r>
               <w:rPr>
                 <w:rFonts w:ascii="Calibri" w:eastAsia="Calibri" w:hAnsi="Calibri" w:cs="Calibri"/>
@@ -941,17 +609,7 @@
                 <w:bCs/>
                 <w:color w:val="5B3FC4"/>
               </w:rPr>
-              <w:t>🔗  Live</w:t>
-            </w:r>
-            <w:proofErr w:type="gramEnd"/>
-            <w:r>
-              <w:rPr>
-                <w:rFonts w:ascii="Calibri" w:eastAsia="Calibri" w:hAnsi="Calibri" w:cs="Calibri"/>
-                <w:b/>
-                <w:bCs/>
-                <w:color w:val="5B3FC4"/>
-              </w:rPr>
-              <w:t xml:space="preserve"> Deployments &amp; Portfolio: </w:t>
+              <w:t xml:space="preserve">🔗  Live Deployments &amp; Portfolio: </w:t>
             </w:r>
           </w:p>
           <w:p>
@@ -965,27 +623,7 @@
                 <w:sz w:val="19"/>
                 <w:szCs w:val="19"/>
               </w:rPr>
-              <w:t xml:space="preserve">Mental Health </w:t>
-            </w:r>
-            <w:proofErr w:type="gramStart"/>
-            <w:r>
-              <w:rPr>
-                <w:rFonts w:ascii="Calibri" w:eastAsia="Calibri" w:hAnsi="Calibri" w:cs="Calibri"/>
-                <w:color w:val="555555"/>
-                <w:sz w:val="19"/>
-                <w:szCs w:val="19"/>
-              </w:rPr>
-              <w:t>Dashboard  →</w:t>
-            </w:r>
-            <w:proofErr w:type="gramEnd"/>
-            <w:r>
-              <w:rPr>
-                <w:rFonts w:ascii="Calibri" w:eastAsia="Calibri" w:hAnsi="Calibri" w:cs="Calibri"/>
-                <w:color w:val="555555"/>
-                <w:sz w:val="19"/>
-                <w:szCs w:val="19"/>
-              </w:rPr>
-              <w:t xml:space="preserve">  </w:t>
+              <w:t xml:space="preserve">Mental Health Dashboard  →  </w:t>
             </w:r>
             <w:hyperlink r:id="rId6" w:history="1">
               <w:r>
@@ -1002,13 +640,8 @@
             <w:pPr>
               <w:spacing w:after="30"/>
             </w:pPr>
-            <w:proofErr w:type="spellStart"/>
             <w:r>
-              <w:t>Nhs</w:t>
-            </w:r>
-            <w:proofErr w:type="spellEnd"/>
-            <w:r>
-              <w:t xml:space="preserve"> KPI dashboard </w:t>
+              <w:t xml:space="preserve">Nhs KPI dashboard </w:t>
             </w:r>
             <w:r>
               <w:rPr>
@@ -1027,16 +660,36 @@
                 <w:rPr>
                   <w:rStyle w:val="Hyperlink"/>
                 </w:rPr>
-                <w:t xml:space="preserve">NHS KPI Dashboard · </w:t>
+                <w:t>NHS KPI Dashboard · Streamlit</w:t>
               </w:r>
-              <w:proofErr w:type="spellStart"/>
+            </w:hyperlink>
+          </w:p>
+          <w:p>
+            <w:pPr>
+              <w:spacing w:after="30"/>
+            </w:pPr>
+            <w:r>
+              <w:t xml:space="preserve">Portfolio </w:t>
+            </w:r>
+            <w:r>
+              <w:rPr>
+                <w:rFonts w:ascii="Calibri" w:eastAsia="Calibri" w:hAnsi="Calibri" w:cs="Calibri"/>
+                <w:color w:val="555555"/>
+                <w:sz w:val="19"/>
+                <w:szCs w:val="19"/>
+              </w:rPr>
+              <w:t>→</w:t>
+            </w:r>
+            <w:r>
+              <w:t xml:space="preserve"> </w:t>
+            </w:r>
+            <w:hyperlink r:id="rId8" w:history="1">
               <w:r>
                 <w:rPr>
                   <w:rStyle w:val="Hyperlink"/>
                 </w:rPr>
-                <w:t>Streamlit</w:t>
+                <w:t>Promise Ekwurumadu — Data Portfolio</w:t>
               </w:r>
-              <w:proofErr w:type="spellEnd"/>
             </w:hyperlink>
           </w:p>
           <w:p>
@@ -1047,47 +700,17 @@
                 <w:sz w:val="19"/>
                 <w:szCs w:val="19"/>
               </w:rPr>
-              <w:t xml:space="preserve">Full code, notebooks &amp; all </w:t>
+              <w:t xml:space="preserve">Full code, notebooks &amp; all dashboards  →  </w:t>
             </w:r>
-            <w:proofErr w:type="gramStart"/>
-            <w:r>
-              <w:rPr>
-                <w:rFonts w:ascii="Calibri" w:eastAsia="Calibri" w:hAnsi="Calibri" w:cs="Calibri"/>
-                <w:color w:val="555555"/>
-                <w:sz w:val="19"/>
-                <w:szCs w:val="19"/>
-              </w:rPr>
-              <w:t>dashboards  →</w:t>
-            </w:r>
-            <w:proofErr w:type="gramEnd"/>
-            <w:r>
-              <w:rPr>
-                <w:rFonts w:ascii="Calibri" w:eastAsia="Calibri" w:hAnsi="Calibri" w:cs="Calibri"/>
-                <w:color w:val="555555"/>
-                <w:sz w:val="19"/>
-                <w:szCs w:val="19"/>
-              </w:rPr>
-              <w:t xml:space="preserve">  </w:t>
-            </w:r>
-            <w:hyperlink r:id="rId8" w:history="1">
+            <w:hyperlink r:id="rId9" w:history="1">
               <w:r>
                 <w:rPr>
                   <w:rFonts w:ascii="Calibri" w:eastAsia="Calibri" w:hAnsi="Calibri" w:cs="Calibri"/>
                   <w:color w:val="5B3FC4"/>
                   <w:u w:val="single"/>
                 </w:rPr>
-                <w:t>github.com/</w:t>
+                <w:t>github.com/promiseekwurumadu</w:t>
               </w:r>
-              <w:proofErr w:type="spellStart"/>
-              <w:r>
-                <w:rPr>
-                  <w:rFonts w:ascii="Calibri" w:eastAsia="Calibri" w:hAnsi="Calibri" w:cs="Calibri"/>
-                  <w:color w:val="5B3FC4"/>
-                  <w:u w:val="single"/>
-                </w:rPr>
-                <w:t>promiseekwurumadu</w:t>
-              </w:r>
-              <w:proofErr w:type="spellEnd"/>
             </w:hyperlink>
           </w:p>
         </w:tc>
@@ -1122,31 +745,7 @@
           <w:sz w:val="21"/>
           <w:szCs w:val="21"/>
         </w:rPr>
-        <w:t>Global Supply Chain Big Data Pipeline (</w:t>
-      </w:r>
-      <w:proofErr w:type="spellStart"/>
-      <w:r>
-        <w:rPr>
-          <w:rFonts w:ascii="Calibri" w:eastAsia="Calibri" w:hAnsi="Calibri" w:cs="Calibri"/>
-          <w:b/>
-          <w:bCs/>
-          <w:color w:val="5B3FC4"/>
-          <w:sz w:val="21"/>
-          <w:szCs w:val="21"/>
-        </w:rPr>
-        <w:t>PySpark</w:t>
-      </w:r>
-      <w:proofErr w:type="spellEnd"/>
-      <w:r>
-        <w:rPr>
-          <w:rFonts w:ascii="Calibri" w:eastAsia="Calibri" w:hAnsi="Calibri" w:cs="Calibri"/>
-          <w:b/>
-          <w:bCs/>
-          <w:color w:val="5B3FC4"/>
-          <w:sz w:val="21"/>
-          <w:szCs w:val="21"/>
-        </w:rPr>
-        <w:t xml:space="preserve"> + Hadoop)</w:t>
+        <w:t>Global Supply Chain Big Data Pipeline (PySpark + Hadoop)</w:t>
       </w:r>
     </w:p>
     <w:p>
@@ -1163,23 +762,7 @@
           <w:rFonts w:ascii="Calibri" w:eastAsia="Calibri" w:hAnsi="Calibri" w:cs="Calibri"/>
           <w:color w:val="555555"/>
         </w:rPr>
-        <w:t xml:space="preserve">Built end-to-end pipeline processing 500,000 trade records using </w:t>
-      </w:r>
-      <w:proofErr w:type="spellStart"/>
-      <w:r>
-        <w:rPr>
-          <w:rFonts w:ascii="Calibri" w:eastAsia="Calibri" w:hAnsi="Calibri" w:cs="Calibri"/>
-          <w:color w:val="555555"/>
-        </w:rPr>
-        <w:t>PySpark</w:t>
-      </w:r>
-      <w:proofErr w:type="spellEnd"/>
-      <w:r>
-        <w:rPr>
-          <w:rFonts w:ascii="Calibri" w:eastAsia="Calibri" w:hAnsi="Calibri" w:cs="Calibri"/>
-          <w:color w:val="555555"/>
-        </w:rPr>
-        <w:t xml:space="preserve"> 4.1.2 on a local Hadoop cluster via Docker</w:t>
+        <w:t>Built end-to-end pipeline processing 500,000 trade records using PySpark 4.1.2 on a local Hadoop cluster via Docker</w:t>
       </w:r>
     </w:p>
     <w:p>
@@ -1196,39 +779,7 @@
           <w:rFonts w:ascii="Calibri" w:eastAsia="Calibri" w:hAnsi="Calibri" w:cs="Calibri"/>
           <w:color w:val="555555"/>
         </w:rPr>
-        <w:t xml:space="preserve">Stored 62.97MB dataset in HDFS distributed file system — </w:t>
-      </w:r>
-      <w:proofErr w:type="spellStart"/>
-      <w:r>
-        <w:rPr>
-          <w:rFonts w:ascii="Calibri" w:eastAsia="Calibri" w:hAnsi="Calibri" w:cs="Calibri"/>
-          <w:color w:val="555555"/>
-        </w:rPr>
-        <w:t>namenode</w:t>
-      </w:r>
-      <w:proofErr w:type="spellEnd"/>
-      <w:r>
-        <w:rPr>
-          <w:rFonts w:ascii="Calibri" w:eastAsia="Calibri" w:hAnsi="Calibri" w:cs="Calibri"/>
-          <w:color w:val="555555"/>
-        </w:rPr>
-        <w:t xml:space="preserve"> and </w:t>
-      </w:r>
-      <w:proofErr w:type="spellStart"/>
-      <w:r>
-        <w:rPr>
-          <w:rFonts w:ascii="Calibri" w:eastAsia="Calibri" w:hAnsi="Calibri" w:cs="Calibri"/>
-          <w:color w:val="555555"/>
-        </w:rPr>
-        <w:t>datanode</w:t>
-      </w:r>
-      <w:proofErr w:type="spellEnd"/>
-      <w:r>
-        <w:rPr>
-          <w:rFonts w:ascii="Calibri" w:eastAsia="Calibri" w:hAnsi="Calibri" w:cs="Calibri"/>
-          <w:color w:val="555555"/>
-        </w:rPr>
-        <w:t xml:space="preserve"> containers configured via docker-compose</w:t>
+        <w:t>Stored 62.97MB dataset in HDFS distributed file system — namenode and datanode containers configured via docker-compose</w:t>
       </w:r>
     </w:p>
     <w:p>
@@ -1240,21 +791,12 @@
         </w:numPr>
         <w:spacing w:after="50"/>
       </w:pPr>
-      <w:proofErr w:type="spellStart"/>
-      <w:r>
-        <w:rPr>
-          <w:rFonts w:ascii="Calibri" w:eastAsia="Calibri" w:hAnsi="Calibri" w:cs="Calibri"/>
-          <w:color w:val="555555"/>
-        </w:rPr>
-        <w:t>PySpark</w:t>
-      </w:r>
-      <w:proofErr w:type="spellEnd"/>
-      <w:r>
-        <w:rPr>
-          <w:rFonts w:ascii="Calibri" w:eastAsia="Calibri" w:hAnsi="Calibri" w:cs="Calibri"/>
-          <w:color w:val="555555"/>
-        </w:rPr>
-        <w:t xml:space="preserve"> pipeline: schema definition, data cleaning, 6 distributed aggregations across CPU cores simultaneously</w:t>
+      <w:r>
+        <w:rPr>
+          <w:rFonts w:ascii="Calibri" w:eastAsia="Calibri" w:hAnsi="Calibri" w:cs="Calibri"/>
+          <w:color w:val="555555"/>
+        </w:rPr>
+        <w:t>PySpark pipeline: schema definition, data cleaning, 6 distributed aggregations across CPU cores simultaneously</w:t>
       </w:r>
     </w:p>
     <w:p>
@@ -1287,31 +829,7 @@
           <w:sz w:val="18"/>
           <w:szCs w:val="18"/>
         </w:rPr>
-        <w:t xml:space="preserve">Tools: Python · </w:t>
-      </w:r>
-      <w:proofErr w:type="spellStart"/>
-      <w:r>
-        <w:rPr>
-          <w:rFonts w:ascii="Calibri" w:eastAsia="Calibri" w:hAnsi="Calibri" w:cs="Calibri"/>
-          <w:i/>
-          <w:iCs/>
-          <w:color w:val="555555"/>
-          <w:sz w:val="18"/>
-          <w:szCs w:val="18"/>
-        </w:rPr>
-        <w:t>PySpark</w:t>
-      </w:r>
-      <w:proofErr w:type="spellEnd"/>
-      <w:r>
-        <w:rPr>
-          <w:rFonts w:ascii="Calibri" w:eastAsia="Calibri" w:hAnsi="Calibri" w:cs="Calibri"/>
-          <w:i/>
-          <w:iCs/>
-          <w:color w:val="555555"/>
-          <w:sz w:val="18"/>
-          <w:szCs w:val="18"/>
-        </w:rPr>
-        <w:t xml:space="preserve"> · Hadoop HDFS · Docker · PostgreSQL · Power BI</w:t>
+        <w:t>Tools: Python · PySpark · Hadoop HDFS · Docker · PostgreSQL · Power BI</w:t>
       </w:r>
     </w:p>
     <w:p>
@@ -1395,23 +913,7 @@
           <w:rFonts w:ascii="Calibri" w:eastAsia="Calibri" w:hAnsi="Calibri" w:cs="Calibri"/>
           <w:color w:val="555555"/>
         </w:rPr>
-        <w:t xml:space="preserve">Deployed live </w:t>
-      </w:r>
-      <w:proofErr w:type="spellStart"/>
-      <w:r>
-        <w:rPr>
-          <w:rFonts w:ascii="Calibri" w:eastAsia="Calibri" w:hAnsi="Calibri" w:cs="Calibri"/>
-          <w:color w:val="555555"/>
-        </w:rPr>
-        <w:t>Streamlit</w:t>
-      </w:r>
-      <w:proofErr w:type="spellEnd"/>
-      <w:r>
-        <w:rPr>
-          <w:rFonts w:ascii="Calibri" w:eastAsia="Calibri" w:hAnsi="Calibri" w:cs="Calibri"/>
-          <w:color w:val="555555"/>
-        </w:rPr>
-        <w:t xml:space="preserve"> dashboard publicly — accessible to any recruiter or employer without login</w:t>
+        <w:t>Deployed live Streamlit dashboard publicly — accessible to any recruiter or employer without login</w:t>
       </w:r>
     </w:p>
     <w:p>
@@ -1427,31 +929,7 @@
           <w:sz w:val="18"/>
           <w:szCs w:val="18"/>
         </w:rPr>
-        <w:t xml:space="preserve">Tools: Python · SQLite · </w:t>
-      </w:r>
-      <w:proofErr w:type="spellStart"/>
-      <w:r>
-        <w:rPr>
-          <w:rFonts w:ascii="Calibri" w:eastAsia="Calibri" w:hAnsi="Calibri" w:cs="Calibri"/>
-          <w:i/>
-          <w:iCs/>
-          <w:color w:val="555555"/>
-          <w:sz w:val="18"/>
-          <w:szCs w:val="18"/>
-        </w:rPr>
-        <w:t>Streamlit</w:t>
-      </w:r>
-      <w:proofErr w:type="spellEnd"/>
-      <w:r>
-        <w:rPr>
-          <w:rFonts w:ascii="Calibri" w:eastAsia="Calibri" w:hAnsi="Calibri" w:cs="Calibri"/>
-          <w:i/>
-          <w:iCs/>
-          <w:color w:val="555555"/>
-          <w:sz w:val="18"/>
-          <w:szCs w:val="18"/>
-        </w:rPr>
-        <w:t xml:space="preserve"> · Plotly · Pandas</w:t>
+        <w:t>Tools: Python · SQLite · Streamlit · Plotly · Pandas</w:t>
       </w:r>
     </w:p>
     <w:p>
@@ -1519,23 +997,7 @@
           <w:rFonts w:ascii="Calibri" w:eastAsia="Calibri" w:hAnsi="Calibri" w:cs="Calibri"/>
           <w:color w:val="555555"/>
         </w:rPr>
-        <w:t xml:space="preserve">Loaded records in chunks using </w:t>
-      </w:r>
-      <w:proofErr w:type="spellStart"/>
-      <w:r>
-        <w:rPr>
-          <w:rFonts w:ascii="Calibri" w:eastAsia="Calibri" w:hAnsi="Calibri" w:cs="Calibri"/>
-          <w:color w:val="555555"/>
-        </w:rPr>
-        <w:t>SQLAlchemy</w:t>
-      </w:r>
-      <w:proofErr w:type="spellEnd"/>
-      <w:r>
-        <w:rPr>
-          <w:rFonts w:ascii="Calibri" w:eastAsia="Calibri" w:hAnsi="Calibri" w:cs="Calibri"/>
-          <w:color w:val="555555"/>
-        </w:rPr>
-        <w:t xml:space="preserve"> — connected Power BI live to PostgreSQL for real-time dashboard refresh</w:t>
+        <w:t>Loaded records in chunks using SQLAlchemy — connected Power BI live to PostgreSQL for real-time dashboard refresh</w:t>
       </w:r>
     </w:p>
     <w:p>
@@ -1551,55 +1013,7 @@
           <w:sz w:val="18"/>
           <w:szCs w:val="18"/>
         </w:rPr>
-        <w:t xml:space="preserve">Tools: Python · PostgreSQL · </w:t>
-      </w:r>
-      <w:proofErr w:type="spellStart"/>
-      <w:r>
-        <w:rPr>
-          <w:rFonts w:ascii="Calibri" w:eastAsia="Calibri" w:hAnsi="Calibri" w:cs="Calibri"/>
-          <w:i/>
-          <w:iCs/>
-          <w:color w:val="555555"/>
-          <w:sz w:val="18"/>
-          <w:szCs w:val="18"/>
-        </w:rPr>
-        <w:t>pgAdmin</w:t>
-      </w:r>
-      <w:proofErr w:type="spellEnd"/>
-      <w:r>
-        <w:rPr>
-          <w:rFonts w:ascii="Calibri" w:eastAsia="Calibri" w:hAnsi="Calibri" w:cs="Calibri"/>
-          <w:i/>
-          <w:iCs/>
-          <w:color w:val="555555"/>
-          <w:sz w:val="18"/>
-          <w:szCs w:val="18"/>
-        </w:rPr>
-        <w:t xml:space="preserve"> · </w:t>
-      </w:r>
-      <w:proofErr w:type="spellStart"/>
-      <w:r>
-        <w:rPr>
-          <w:rFonts w:ascii="Calibri" w:eastAsia="Calibri" w:hAnsi="Calibri" w:cs="Calibri"/>
-          <w:i/>
-          <w:iCs/>
-          <w:color w:val="555555"/>
-          <w:sz w:val="18"/>
-          <w:szCs w:val="18"/>
-        </w:rPr>
-        <w:t>SQLAlchemy</w:t>
-      </w:r>
-      <w:proofErr w:type="spellEnd"/>
-      <w:r>
-        <w:rPr>
-          <w:rFonts w:ascii="Calibri" w:eastAsia="Calibri" w:hAnsi="Calibri" w:cs="Calibri"/>
-          <w:i/>
-          <w:iCs/>
-          <w:color w:val="555555"/>
-          <w:sz w:val="18"/>
-          <w:szCs w:val="18"/>
-        </w:rPr>
-        <w:t xml:space="preserve"> · Power BI</w:t>
+        <w:t>Tools: Python · PostgreSQL · pgAdmin · SQLAlchemy · Power BI</w:t>
       </w:r>
     </w:p>
     <w:p>
@@ -1888,7 +1302,16 @@
           <w:bCs/>
           <w:color w:val="555555"/>
         </w:rPr>
-        <w:t>Freelance / Contract</w:t>
+        <w:t>Patvic Tech LTD</w:t>
+      </w:r>
+      <w:r>
+        <w:rPr>
+          <w:rFonts w:ascii="Calibri" w:eastAsia="Calibri" w:hAnsi="Calibri" w:cs="Calibri"/>
+          <w:b/>
+          <w:bCs/>
+          <w:color w:val="555555"/>
+        </w:rPr>
+        <w:t xml:space="preserve"> / Contract</w:t>
       </w:r>
     </w:p>
     <w:p>
@@ -1900,21 +1323,12 @@
         </w:numPr>
         <w:spacing w:after="50"/>
       </w:pPr>
-      <w:proofErr w:type="spellStart"/>
-      <w:r>
-        <w:rPr>
-          <w:rFonts w:ascii="Calibri" w:eastAsia="Calibri" w:hAnsi="Calibri" w:cs="Calibri"/>
-          <w:color w:val="555555"/>
-        </w:rPr>
-        <w:t>Preprocessed</w:t>
-      </w:r>
-      <w:proofErr w:type="spellEnd"/>
-      <w:r>
-        <w:rPr>
-          <w:rFonts w:ascii="Calibri" w:eastAsia="Calibri" w:hAnsi="Calibri" w:cs="Calibri"/>
-          <w:color w:val="555555"/>
-        </w:rPr>
-        <w:t xml:space="preserve"> and analysed large datasets across multiple data-driven projects using Python and SQL</w:t>
+      <w:r>
+        <w:rPr>
+          <w:rFonts w:ascii="Calibri" w:eastAsia="Calibri" w:hAnsi="Calibri" w:cs="Calibri"/>
+          <w:color w:val="555555"/>
+        </w:rPr>
+        <w:t>Preprocessed and analysed large datasets across multiple data-driven projects using Python and SQL</w:t>
       </w:r>
     </w:p>
     <w:p>

</xml_diff>